<commit_message>
personal website replace by sloxen
</commit_message>
<xml_diff>
--- a/assets/work/cv/Xi_Lu_DS_CV.docx
+++ b/assets/work/cv/Xi_Lu_DS_CV.docx
@@ -16,23 +16,24 @@
         <w:rPr>
           <w:b/>
           <w:bCs/>
+          <w:noProof/>
           <w:color w:val="0070C0"/>
           <w:sz w:val="24"/>
           <w:szCs w:val="24"/>
         </w:rPr>
         <w:drawing>
-          <wp:anchor distT="0" distB="0" distL="114300" distR="114300" simplePos="0" relativeHeight="251685888" behindDoc="0" locked="0" layoutInCell="1" allowOverlap="1" wp14:anchorId="06F7EB84" wp14:editId="74772567">
+          <wp:anchor distT="0" distB="0" distL="114300" distR="114300" simplePos="0" relativeHeight="251657216" behindDoc="0" locked="0" layoutInCell="1" allowOverlap="1" wp14:anchorId="3144F879" wp14:editId="7EBD9DD5">
             <wp:simplePos x="0" y="0"/>
             <wp:positionH relativeFrom="column">
-              <wp:posOffset>1439573</wp:posOffset>
+              <wp:posOffset>1203960</wp:posOffset>
             </wp:positionH>
-            <wp:positionV relativeFrom="paragraph">
-              <wp:posOffset>1046</wp:posOffset>
+            <wp:positionV relativeFrom="page">
+              <wp:posOffset>862965</wp:posOffset>
             </wp:positionV>
             <wp:extent cx="228600" cy="228600"/>
             <wp:effectExtent l="0" t="0" r="0" b="0"/>
             <wp:wrapNone/>
-            <wp:docPr id="194887018" name="Graphic 1">
+            <wp:docPr id="1673597544" name="Graphic 1">
               <a:hlinkClick xmlns:a="http://schemas.openxmlformats.org/drawingml/2006/main" r:id="rId6"/>
             </wp:docPr>
             <wp:cNvGraphicFramePr>
@@ -42,7 +43,7 @@
               <a:graphicData uri="http://schemas.openxmlformats.org/drawingml/2006/picture">
                 <pic:pic xmlns:pic="http://schemas.openxmlformats.org/drawingml/2006/picture">
                   <pic:nvPicPr>
-                    <pic:cNvPr id="194887018" name="Graphic 1">
+                    <pic:cNvPr id="1673597544" name="Graphic 1">
                       <a:hlinkClick r:id="rId6"/>
                     </pic:cNvPr>
                     <pic:cNvPicPr/>
@@ -78,23 +79,24 @@
         <w:rPr>
           <w:b/>
           <w:bCs/>
+          <w:noProof/>
           <w:color w:val="0070C0"/>
           <w:sz w:val="24"/>
           <w:szCs w:val="24"/>
         </w:rPr>
         <w:drawing>
-          <wp:anchor distT="0" distB="0" distL="114300" distR="114300" simplePos="0" relativeHeight="251641856" behindDoc="0" locked="0" layoutInCell="1" allowOverlap="1" wp14:anchorId="3144F879" wp14:editId="5C08B471">
+          <wp:anchor distT="0" distB="0" distL="114300" distR="114300" simplePos="0" relativeHeight="251659264" behindDoc="0" locked="0" layoutInCell="1" allowOverlap="1" wp14:anchorId="06F7EB84" wp14:editId="20149948">
             <wp:simplePos x="0" y="0"/>
             <wp:positionH relativeFrom="column">
-              <wp:posOffset>1203743</wp:posOffset>
+              <wp:posOffset>1440180</wp:posOffset>
             </wp:positionH>
-            <wp:positionV relativeFrom="paragraph">
-              <wp:posOffset>-1326</wp:posOffset>
+            <wp:positionV relativeFrom="page">
+              <wp:posOffset>864870</wp:posOffset>
             </wp:positionV>
             <wp:extent cx="228600" cy="228600"/>
             <wp:effectExtent l="0" t="0" r="0" b="0"/>
             <wp:wrapNone/>
-            <wp:docPr id="1673597544" name="Graphic 1">
+            <wp:docPr id="194887018" name="Graphic 1">
               <a:hlinkClick xmlns:a="http://schemas.openxmlformats.org/drawingml/2006/main" r:id="rId9"/>
             </wp:docPr>
             <wp:cNvGraphicFramePr>
@@ -104,7 +106,7 @@
               <a:graphicData uri="http://schemas.openxmlformats.org/drawingml/2006/picture">
                 <pic:pic xmlns:pic="http://schemas.openxmlformats.org/drawingml/2006/picture">
                   <pic:nvPicPr>
-                    <pic:cNvPr id="1673597544" name="Graphic 1">
+                    <pic:cNvPr id="194887018" name="Graphic 1">
                       <a:hlinkClick r:id="rId9"/>
                     </pic:cNvPr>
                     <pic:cNvPicPr/>
@@ -141,13 +143,13 @@
           <w:noProof/>
         </w:rPr>
         <w:drawing>
-          <wp:anchor distT="0" distB="0" distL="114300" distR="114300" simplePos="0" relativeHeight="251706368" behindDoc="0" locked="0" layoutInCell="1" allowOverlap="1" wp14:anchorId="70DC9E07" wp14:editId="151846C3">
+          <wp:anchor distT="0" distB="0" distL="114300" distR="114300" simplePos="0" relativeHeight="251706368" behindDoc="0" locked="0" layoutInCell="1" allowOverlap="1" wp14:anchorId="70DC9E07" wp14:editId="4EF02DBE">
             <wp:simplePos x="0" y="0"/>
             <wp:positionH relativeFrom="column">
-              <wp:posOffset>967510</wp:posOffset>
+              <wp:posOffset>967740</wp:posOffset>
             </wp:positionH>
-            <wp:positionV relativeFrom="paragraph">
-              <wp:posOffset>-1905</wp:posOffset>
+            <wp:positionV relativeFrom="page">
+              <wp:posOffset>862965</wp:posOffset>
             </wp:positionV>
             <wp:extent cx="228600" cy="228600"/>
             <wp:effectExtent l="0" t="0" r="0" b="0"/>
@@ -659,7 +661,14 @@
           <w:b/>
           <w:bCs/>
         </w:rPr>
-        <w:t xml:space="preserve"> Sloths Intel</w:t>
+        <w:t xml:space="preserve"> Slo</w:t>
+      </w:r>
+      <w:r>
+        <w:rPr>
+          <w:b/>
+          <w:bCs/>
+        </w:rPr>
+        <w:t>xen Ltd</w:t>
       </w:r>
       <w:r>
         <w:rPr>
@@ -721,7 +730,13 @@
         <w:spacing w:after="40"/>
       </w:pPr>
       <w:r>
-        <w:t>Lead Sloths Intel, overseeing hybrid intelligence frameworks that combine data, machine learning, and expert judgment to produce actionable and trustworthy insights</w:t>
+        <w:t>Lead Slo</w:t>
+      </w:r>
+      <w:r>
+        <w:t>xen Ltd</w:t>
+      </w:r>
+      <w:r>
+        <w:t>, overseeing hybrid intelligence frameworks that combine data, machine learning, and expert judgment to produce actionable and trustworthy insights</w:t>
       </w:r>
       <w:r>
         <w:t>.</w:t>
@@ -14742,6 +14757,29 @@
       </w:tcPr>
     </w:tblStylePr>
   </w:style>
+  <w:style w:type="character" w:styleId="Hyperlink">
+    <w:name w:val="Hyperlink"/>
+    <w:basedOn w:val="DefaultParagraphFont"/>
+    <w:uiPriority w:val="99"/>
+    <w:unhideWhenUsed/>
+    <w:rsid w:val="00317146"/>
+    <w:rPr>
+      <w:color w:val="0000FF" w:themeColor="hyperlink"/>
+      <w:u w:val="single"/>
+    </w:rPr>
+  </w:style>
+  <w:style w:type="character" w:styleId="UnresolvedMention">
+    <w:name w:val="Unresolved Mention"/>
+    <w:basedOn w:val="DefaultParagraphFont"/>
+    <w:uiPriority w:val="99"/>
+    <w:semiHidden/>
+    <w:unhideWhenUsed/>
+    <w:rsid w:val="00317146"/>
+    <w:rPr>
+      <w:color w:val="605E5C"/>
+      <w:shd w:val="clear" w:color="auto" w:fill="E1DFDD"/>
+    </w:rPr>
+  </w:style>
 </w:styles>
 </file>
 

</xml_diff>